<commit_message>
Update Python Developer experience start date to Jun 2025
</commit_message>
<xml_diff>
--- a/assets/Pranali_Hagare_Resume.docx
+++ b/assets/Pranali_Hagare_Resume.docx
@@ -42,31 +42,43 @@
           <w:color w:val="464646"/>
           <w:sz w:val="19"/>
         </w:rPr>
-        <w:t>📞</w:t>
+        <w:t>📞 +91-</w:t>
       </w:r>
+      <w:proofErr w:type="gramStart"/>
       <w:r>
         <w:rPr>
           <w:rFonts w:ascii="Calibri" w:hAnsi="Calibri"/>
           <w:color w:val="464646"/>
           <w:sz w:val="19"/>
         </w:rPr>
-        <w:t xml:space="preserve"> +91-9356463434  •  ✉ pranalihagare@gmail.com  •  </w:t>
+        <w:t>9356463434  •</w:t>
       </w:r>
+      <w:proofErr w:type="gramEnd"/>
       <w:r>
         <w:rPr>
           <w:rFonts w:ascii="Calibri" w:hAnsi="Calibri"/>
           <w:color w:val="464646"/>
           <w:sz w:val="19"/>
         </w:rPr>
-        <w:t>📍</w:t>
+        <w:t xml:space="preserve">  ✉ </w:t>
       </w:r>
+      <w:proofErr w:type="gramStart"/>
       <w:r>
         <w:rPr>
           <w:rFonts w:ascii="Calibri" w:hAnsi="Calibri"/>
           <w:color w:val="464646"/>
           <w:sz w:val="19"/>
         </w:rPr>
-        <w:t xml:space="preserve"> Pune, Maharashtra</w:t>
+        <w:t>pranalihagare@gmail.com  •</w:t>
+      </w:r>
+      <w:proofErr w:type="gramEnd"/>
+      <w:r>
+        <w:rPr>
+          <w:rFonts w:ascii="Calibri" w:hAnsi="Calibri"/>
+          <w:color w:val="464646"/>
+          <w:sz w:val="19"/>
+        </w:rPr>
+        <w:t xml:space="preserve">  📍 Pune, Maharashtra</w:t>
       </w:r>
     </w:p>
     <w:p>
@@ -79,14 +91,7 @@
           <w:rFonts w:ascii="Calibri" w:hAnsi="Calibri"/>
           <w:sz w:val="19"/>
         </w:rPr>
-        <w:t>🌐</w:t>
-      </w:r>
-      <w:r>
-        <w:rPr>
-          <w:rFonts w:ascii="Calibri" w:hAnsi="Calibri"/>
-          <w:sz w:val="19"/>
-        </w:rPr>
-        <w:t xml:space="preserve"> </w:t>
+        <w:t xml:space="preserve">🌐 </w:t>
       </w:r>
       <w:hyperlink r:id="rId6">
         <w:r>
@@ -105,23 +110,7 @@
           <w:color w:val="464646"/>
           <w:sz w:val="19"/>
         </w:rPr>
-        <w:t xml:space="preserve">  •  </w:t>
-      </w:r>
-      <w:r>
-        <w:rPr>
-          <w:rFonts w:ascii="Calibri" w:hAnsi="Calibri"/>
-          <w:color w:val="464646"/>
-          <w:sz w:val="19"/>
-        </w:rPr>
-        <w:t>🔗</w:t>
-      </w:r>
-      <w:r>
-        <w:rPr>
-          <w:rFonts w:ascii="Calibri" w:hAnsi="Calibri"/>
-          <w:color w:val="464646"/>
-          <w:sz w:val="19"/>
-        </w:rPr>
-        <w:t xml:space="preserve"> </w:t>
+        <w:t xml:space="preserve">  •  🔗 </w:t>
       </w:r>
       <w:hyperlink r:id="rId7">
         <w:r>
@@ -140,23 +129,7 @@
           <w:color w:val="464646"/>
           <w:sz w:val="19"/>
         </w:rPr>
-        <w:t xml:space="preserve">  •  </w:t>
-      </w:r>
-      <w:r>
-        <w:rPr>
-          <w:rFonts w:ascii="Calibri" w:hAnsi="Calibri"/>
-          <w:color w:val="464646"/>
-          <w:sz w:val="19"/>
-        </w:rPr>
-        <w:t>💻</w:t>
-      </w:r>
-      <w:r>
-        <w:rPr>
-          <w:rFonts w:ascii="Calibri" w:hAnsi="Calibri"/>
-          <w:color w:val="464646"/>
-          <w:sz w:val="19"/>
-        </w:rPr>
-        <w:t xml:space="preserve"> </w:t>
+        <w:t xml:space="preserve">  •  💻 </w:t>
       </w:r>
       <w:hyperlink r:id="rId8">
         <w:r>
@@ -197,7 +170,25 @@
           <w:color w:val="282828"/>
           <w:sz w:val="19"/>
         </w:rPr>
-        <w:t>Results-driven AI &amp; Data Science Engineer and Python Developer with 1.5 years of experience in backend development, RESTful API engineering, machine learning, and AI-driven platforms. Proficient in Python, FastAPI, SQL, PostgreSQL, and data pipelines, with hands-on expertise in building secure authentication flows, database integrations, real-time computer vision translation engines, and Generative AI systems (RAG, LangGraph). Co-author of an Indian Govt. Copyright and an IEEE publication.</w:t>
+        <w:t xml:space="preserve">Results-driven AI &amp; Data Science Engineer and Python Developer with 1.5 years of experience in backend development, RESTful API engineering, machine learning, and AI-driven platforms. Proficient in Python, </w:t>
+      </w:r>
+      <w:proofErr w:type="spellStart"/>
+      <w:r>
+        <w:rPr>
+          <w:rFonts w:ascii="Calibri" w:hAnsi="Calibri"/>
+          <w:color w:val="282828"/>
+          <w:sz w:val="19"/>
+        </w:rPr>
+        <w:t>FastAPI</w:t>
+      </w:r>
+      <w:proofErr w:type="spellEnd"/>
+      <w:r>
+        <w:rPr>
+          <w:rFonts w:ascii="Calibri" w:hAnsi="Calibri"/>
+          <w:color w:val="282828"/>
+          <w:sz w:val="19"/>
+        </w:rPr>
+        <w:t>, SQL, PostgreSQL, and data pipelines, with hands-on expertise in building secure authentication flows, database integrations, real-time computer vision translation engines, and Generative AI systems (RAG, LangGraph). Co-author of an Indian Govt. Copyright and an IEEE publication.</w:t>
       </w:r>
     </w:p>
     <w:p>
@@ -236,7 +227,79 @@
           <w:color w:val="323232"/>
           <w:sz w:val="19"/>
         </w:rPr>
-        <w:t>Python, SQL, FastAPI, AsyncIO, REST APIs, Starlette, Pydantic, Uvicorn, OOP, Pandas, NumPy, Scikit-learn</w:t>
+        <w:t xml:space="preserve">Python, SQL, </w:t>
+      </w:r>
+      <w:proofErr w:type="spellStart"/>
+      <w:r>
+        <w:rPr>
+          <w:rFonts w:ascii="Calibri" w:hAnsi="Calibri"/>
+          <w:color w:val="323232"/>
+          <w:sz w:val="19"/>
+        </w:rPr>
+        <w:t>FastAPI</w:t>
+      </w:r>
+      <w:proofErr w:type="spellEnd"/>
+      <w:r>
+        <w:rPr>
+          <w:rFonts w:ascii="Calibri" w:hAnsi="Calibri"/>
+          <w:color w:val="323232"/>
+          <w:sz w:val="19"/>
+        </w:rPr>
+        <w:t xml:space="preserve">, </w:t>
+      </w:r>
+      <w:proofErr w:type="spellStart"/>
+      <w:r>
+        <w:rPr>
+          <w:rFonts w:ascii="Calibri" w:hAnsi="Calibri"/>
+          <w:color w:val="323232"/>
+          <w:sz w:val="19"/>
+        </w:rPr>
+        <w:t>AsyncIO</w:t>
+      </w:r>
+      <w:proofErr w:type="spellEnd"/>
+      <w:r>
+        <w:rPr>
+          <w:rFonts w:ascii="Calibri" w:hAnsi="Calibri"/>
+          <w:color w:val="323232"/>
+          <w:sz w:val="19"/>
+        </w:rPr>
+        <w:t xml:space="preserve">, REST APIs, Starlette, </w:t>
+      </w:r>
+      <w:proofErr w:type="spellStart"/>
+      <w:r>
+        <w:rPr>
+          <w:rFonts w:ascii="Calibri" w:hAnsi="Calibri"/>
+          <w:color w:val="323232"/>
+          <w:sz w:val="19"/>
+        </w:rPr>
+        <w:t>Pydantic</w:t>
+      </w:r>
+      <w:proofErr w:type="spellEnd"/>
+      <w:r>
+        <w:rPr>
+          <w:rFonts w:ascii="Calibri" w:hAnsi="Calibri"/>
+          <w:color w:val="323232"/>
+          <w:sz w:val="19"/>
+        </w:rPr>
+        <w:t xml:space="preserve">, </w:t>
+      </w:r>
+      <w:proofErr w:type="spellStart"/>
+      <w:r>
+        <w:rPr>
+          <w:rFonts w:ascii="Calibri" w:hAnsi="Calibri"/>
+          <w:color w:val="323232"/>
+          <w:sz w:val="19"/>
+        </w:rPr>
+        <w:t>Uvicorn</w:t>
+      </w:r>
+      <w:proofErr w:type="spellEnd"/>
+      <w:r>
+        <w:rPr>
+          <w:rFonts w:ascii="Calibri" w:hAnsi="Calibri"/>
+          <w:color w:val="323232"/>
+          <w:sz w:val="19"/>
+        </w:rPr>
+        <w:t>, OOP, Pandas, NumPy, Scikit-learn</w:t>
       </w:r>
     </w:p>
     <w:p>
@@ -302,7 +365,43 @@
           <w:color w:val="323232"/>
           <w:sz w:val="19"/>
         </w:rPr>
-        <w:t>RAG (Retrieval-Augmented Generation), LangGraph, Groq API, Vector Databases (ChromaDB), Embeddings</w:t>
+        <w:t xml:space="preserve">RAG (Retrieval-Augmented Generation), LangGraph, </w:t>
+      </w:r>
+      <w:proofErr w:type="spellStart"/>
+      <w:r>
+        <w:rPr>
+          <w:rFonts w:ascii="Calibri" w:hAnsi="Calibri"/>
+          <w:color w:val="323232"/>
+          <w:sz w:val="19"/>
+        </w:rPr>
+        <w:t>Groq</w:t>
+      </w:r>
+      <w:proofErr w:type="spellEnd"/>
+      <w:r>
+        <w:rPr>
+          <w:rFonts w:ascii="Calibri" w:hAnsi="Calibri"/>
+          <w:color w:val="323232"/>
+          <w:sz w:val="19"/>
+        </w:rPr>
+        <w:t xml:space="preserve"> API, Vector Databases (</w:t>
+      </w:r>
+      <w:proofErr w:type="spellStart"/>
+      <w:r>
+        <w:rPr>
+          <w:rFonts w:ascii="Calibri" w:hAnsi="Calibri"/>
+          <w:color w:val="323232"/>
+          <w:sz w:val="19"/>
+        </w:rPr>
+        <w:t>ChromaDB</w:t>
+      </w:r>
+      <w:proofErr w:type="spellEnd"/>
+      <w:r>
+        <w:rPr>
+          <w:rFonts w:ascii="Calibri" w:hAnsi="Calibri"/>
+          <w:color w:val="323232"/>
+          <w:sz w:val="19"/>
+        </w:rPr>
+        <w:t>), Embeddings</w:t>
       </w:r>
     </w:p>
     <w:p>
@@ -324,15 +423,43 @@
           <w:color w:val="323232"/>
           <w:sz w:val="19"/>
         </w:rPr>
-        <w:t>PostgreSQL, MySQL, Supabase, SQLAlchemy, Alembic, Redis, JWT Authentication, Google OAuth</w:t>
+        <w:t xml:space="preserve">PostgreSQL, MySQL, </w:t>
       </w:r>
+      <w:proofErr w:type="spellStart"/>
       <w:r>
         <w:rPr>
           <w:rFonts w:ascii="Calibri" w:hAnsi="Calibri"/>
           <w:color w:val="323232"/>
           <w:sz w:val="19"/>
         </w:rPr>
-        <w:t>, Git, GitLab, Postman</w:t>
+        <w:t>Supabase</w:t>
+      </w:r>
+      <w:proofErr w:type="spellEnd"/>
+      <w:r>
+        <w:rPr>
+          <w:rFonts w:ascii="Calibri" w:hAnsi="Calibri"/>
+          <w:color w:val="323232"/>
+          <w:sz w:val="19"/>
+        </w:rPr>
+        <w:t xml:space="preserve">, </w:t>
+      </w:r>
+      <w:proofErr w:type="spellStart"/>
+      <w:r>
+        <w:rPr>
+          <w:rFonts w:ascii="Calibri" w:hAnsi="Calibri"/>
+          <w:color w:val="323232"/>
+          <w:sz w:val="19"/>
+        </w:rPr>
+        <w:t>SQLAlchemy</w:t>
+      </w:r>
+      <w:proofErr w:type="spellEnd"/>
+      <w:r>
+        <w:rPr>
+          <w:rFonts w:ascii="Calibri" w:hAnsi="Calibri"/>
+          <w:color w:val="323232"/>
+          <w:sz w:val="19"/>
+        </w:rPr>
+        <w:t>, Alembic, Redis, JWT Authentication, Google OAuth, Git, GitLab, Postman</w:t>
       </w:r>
     </w:p>
     <w:p>
@@ -375,6 +502,7 @@
             <w:pPr>
               <w:spacing w:before="80" w:after="20"/>
             </w:pPr>
+            <w:proofErr w:type="spellStart"/>
             <w:r>
               <w:rPr>
                 <w:rFonts w:ascii="Calibri" w:hAnsi="Calibri"/>
@@ -382,7 +510,17 @@
                 <w:color w:val="1E1E1E"/>
                 <w:sz w:val="21"/>
               </w:rPr>
-              <w:t>Leometric Technology Pvt Ltd</w:t>
+              <w:t>Leometric</w:t>
+            </w:r>
+            <w:proofErr w:type="spellEnd"/>
+            <w:r>
+              <w:rPr>
+                <w:rFonts w:ascii="Calibri" w:hAnsi="Calibri"/>
+                <w:b/>
+                <w:color w:val="1E1E1E"/>
+                <w:sz w:val="21"/>
+              </w:rPr>
+              <w:t xml:space="preserve"> Technology Pvt Ltd</w:t>
             </w:r>
             <w:r>
               <w:rPr>
@@ -411,7 +549,25 @@
                 <w:color w:val="282828"/>
                 <w:sz w:val="20"/>
               </w:rPr>
-              <w:t>Jun 2026 – Present</w:t>
+              <w:t>Jun 202</w:t>
+            </w:r>
+            <w:r>
+              <w:rPr>
+                <w:rFonts w:ascii="Calibri" w:hAnsi="Calibri"/>
+                <w:b/>
+                <w:color w:val="282828"/>
+                <w:sz w:val="20"/>
+              </w:rPr>
+              <w:t>5</w:t>
+            </w:r>
+            <w:r>
+              <w:rPr>
+                <w:rFonts w:ascii="Calibri" w:hAnsi="Calibri"/>
+                <w:b/>
+                <w:color w:val="282828"/>
+                <w:sz w:val="20"/>
+              </w:rPr>
+              <w:t xml:space="preserve"> – Present</w:t>
             </w:r>
           </w:p>
         </w:tc>
@@ -428,7 +584,25 @@
           <w:color w:val="282828"/>
           <w:sz w:val="19"/>
         </w:rPr>
-        <w:t>Engineered scalable backend microservices and RESTful API modules using Python and FastAPI to support multi-tenant client applications and core business workflows.</w:t>
+        <w:t xml:space="preserve">Built </w:t>
+      </w:r>
+      <w:proofErr w:type="spellStart"/>
+      <w:r>
+        <w:rPr>
+          <w:rFonts w:ascii="Calibri" w:hAnsi="Calibri"/>
+          <w:color w:val="282828"/>
+          <w:sz w:val="19"/>
+        </w:rPr>
+        <w:t>FastAPI</w:t>
+      </w:r>
+      <w:proofErr w:type="spellEnd"/>
+      <w:r>
+        <w:rPr>
+          <w:rFonts w:ascii="Calibri" w:hAnsi="Calibri"/>
+          <w:color w:val="282828"/>
+          <w:sz w:val="19"/>
+        </w:rPr>
+        <w:t xml:space="preserve"> backend endpoints for a recruiter dashboard, supporting bulk resume upload (multiple PDFs at once) instead of manual one-by-one review.</w:t>
       </w:r>
     </w:p>
     <w:p>
@@ -442,7 +616,25 @@
           <w:color w:val="282828"/>
           <w:sz w:val="19"/>
         </w:rPr>
-        <w:t>Built end-to-end user authentication pipelines incorporating JWT tokens, Google OAuth2, and granular Role-Based Access Control (RBAC) middleware for multi-role permission management.</w:t>
+        <w:t xml:space="preserve">Developed a </w:t>
+      </w:r>
+      <w:proofErr w:type="spellStart"/>
+      <w:r>
+        <w:rPr>
+          <w:rFonts w:ascii="Calibri" w:hAnsi="Calibri"/>
+          <w:color w:val="282828"/>
+          <w:sz w:val="19"/>
+        </w:rPr>
+        <w:t>FastAPI</w:t>
+      </w:r>
+      <w:proofErr w:type="spellEnd"/>
+      <w:r>
+        <w:rPr>
+          <w:rFonts w:ascii="Calibri" w:hAnsi="Calibri"/>
+          <w:color w:val="282828"/>
+          <w:sz w:val="19"/>
+        </w:rPr>
+        <w:t>-based candidate ranking service that scores and sorts resumes automatically, helping recruiters see top matches first.</w:t>
       </w:r>
     </w:p>
     <w:p>
@@ -456,7 +648,25 @@
           <w:color w:val="282828"/>
           <w:sz w:val="19"/>
         </w:rPr>
-        <w:t>Integrated third-party APIs and external webhooks with robust exception handling, structured JSON logging, and error tracking to maintain high service availability.</w:t>
+        <w:t xml:space="preserve">Implemented role-based authentication in </w:t>
+      </w:r>
+      <w:proofErr w:type="spellStart"/>
+      <w:r>
+        <w:rPr>
+          <w:rFonts w:ascii="Calibri" w:hAnsi="Calibri"/>
+          <w:color w:val="282828"/>
+          <w:sz w:val="19"/>
+        </w:rPr>
+        <w:t>FastAPI</w:t>
+      </w:r>
+      <w:proofErr w:type="spellEnd"/>
+      <w:r>
+        <w:rPr>
+          <w:rFonts w:ascii="Calibri" w:hAnsi="Calibri"/>
+          <w:color w:val="282828"/>
+          <w:sz w:val="19"/>
+        </w:rPr>
+        <w:t xml:space="preserve"> to give recruiters secure, permission-based access to the dashboard.</w:t>
       </w:r>
     </w:p>
     <w:p>
@@ -470,21 +680,25 @@
           <w:color w:val="282828"/>
           <w:sz w:val="19"/>
         </w:rPr>
-        <w:t>Modeled relational database schemas in PostgreSQL and MySQL, wrote optimized SQL queries with complex joins, and managed schema migrations using Alembic and SQLAlchemy ORM.</w:t>
+        <w:t xml:space="preserve">Designed and optimized </w:t>
       </w:r>
-    </w:p>
-    <w:p>
-      <w:pPr>
-        <w:pStyle w:val="ListBullet"/>
-        <w:spacing w:before="20" w:after="40" w:line="269" w:lineRule="auto"/>
-      </w:pPr>
+      <w:proofErr w:type="spellStart"/>
       <w:r>
         <w:rPr>
           <w:rFonts w:ascii="Calibri" w:hAnsi="Calibri"/>
           <w:color w:val="282828"/>
           <w:sz w:val="19"/>
         </w:rPr>
-        <w:t>Implemented asynchronous background tasks and Redis caching layers to optimize API response times and reduce database load under peak traffic.</w:t>
+        <w:t>FastAPI</w:t>
+      </w:r>
+      <w:proofErr w:type="spellEnd"/>
+      <w:r>
+        <w:rPr>
+          <w:rFonts w:ascii="Calibri" w:hAnsi="Calibri"/>
+          <w:color w:val="282828"/>
+          <w:sz w:val="19"/>
+        </w:rPr>
+        <w:t xml:space="preserve"> routes to handle bulk resume processing efficiently, reducing manual screening effort for recruiters.</w:t>
       </w:r>
     </w:p>
     <w:tbl>
@@ -510,6 +724,7 @@
             <w:pPr>
               <w:spacing w:before="80" w:after="20"/>
             </w:pPr>
+            <w:proofErr w:type="spellStart"/>
             <w:r>
               <w:rPr>
                 <w:rFonts w:ascii="Calibri" w:hAnsi="Calibri"/>
@@ -517,7 +732,17 @@
                 <w:color w:val="1E1E1E"/>
                 <w:sz w:val="21"/>
               </w:rPr>
-              <w:t>Python Developer Intern</w:t>
+              <w:t>Leometric</w:t>
+            </w:r>
+            <w:proofErr w:type="spellEnd"/>
+            <w:r>
+              <w:rPr>
+                <w:rFonts w:ascii="Calibri" w:hAnsi="Calibri"/>
+                <w:b/>
+                <w:color w:val="1E1E1E"/>
+                <w:sz w:val="21"/>
+              </w:rPr>
+              <w:t xml:space="preserve"> Technology Pvt Ltd</w:t>
             </w:r>
             <w:r>
               <w:rPr>
@@ -526,7 +751,25 @@
                 <w:color w:val="3C3C3C"/>
                 <w:sz w:val="20"/>
               </w:rPr>
-              <w:t xml:space="preserve"> – 6 Months Internship</w:t>
+              <w:t xml:space="preserve"> </w:t>
+            </w:r>
+            <w:r>
+              <w:rPr>
+                <w:rFonts w:ascii="Calibri" w:hAnsi="Calibri"/>
+                <w:i/>
+                <w:color w:val="3C3C3C"/>
+                <w:sz w:val="20"/>
+              </w:rPr>
+              <w:t xml:space="preserve">– </w:t>
+            </w:r>
+            <w:r>
+              <w:rPr>
+                <w:rFonts w:ascii="Calibri" w:hAnsi="Calibri"/>
+                <w:i/>
+                <w:color w:val="3C3C3C"/>
+                <w:sz w:val="20"/>
+              </w:rPr>
+              <w:t>Python Developer Intern</w:t>
             </w:r>
           </w:p>
         </w:tc>
@@ -634,6 +877,7 @@
             <w:pPr>
               <w:spacing w:before="80" w:after="20"/>
             </w:pPr>
+            <w:proofErr w:type="spellStart"/>
             <w:r>
               <w:rPr>
                 <w:rFonts w:ascii="Calibri" w:hAnsi="Calibri"/>
@@ -641,7 +885,17 @@
                 <w:color w:val="1E1E1E"/>
                 <w:sz w:val="21"/>
               </w:rPr>
-              <w:t>HireSense – AI Resume Intelligence Platform</w:t>
+              <w:t>HireSense</w:t>
+            </w:r>
+            <w:proofErr w:type="spellEnd"/>
+            <w:r>
+              <w:rPr>
+                <w:rFonts w:ascii="Calibri" w:hAnsi="Calibri"/>
+                <w:b/>
+                <w:color w:val="1E1E1E"/>
+                <w:sz w:val="21"/>
+              </w:rPr>
+              <w:t xml:space="preserve"> – AI Resume Intelligence Platform</w:t>
             </w:r>
             <w:r>
               <w:rPr>
@@ -650,8 +904,59 @@
                 <w:color w:val="3C3C3C"/>
                 <w:sz w:val="20"/>
               </w:rPr>
-              <w:t xml:space="preserve"> – FastAPI, LangGraph, RAG, ChromaDB, Groq</w:t>
+              <w:t xml:space="preserve"> – </w:t>
             </w:r>
+            <w:proofErr w:type="spellStart"/>
+            <w:r>
+              <w:rPr>
+                <w:rFonts w:ascii="Calibri" w:hAnsi="Calibri"/>
+                <w:i/>
+                <w:color w:val="3C3C3C"/>
+                <w:sz w:val="20"/>
+              </w:rPr>
+              <w:t>FastAPI</w:t>
+            </w:r>
+            <w:proofErr w:type="spellEnd"/>
+            <w:r>
+              <w:rPr>
+                <w:rFonts w:ascii="Calibri" w:hAnsi="Calibri"/>
+                <w:i/>
+                <w:color w:val="3C3C3C"/>
+                <w:sz w:val="20"/>
+              </w:rPr>
+              <w:t xml:space="preserve">, LangGraph, RAG, </w:t>
+            </w:r>
+            <w:proofErr w:type="spellStart"/>
+            <w:r>
+              <w:rPr>
+                <w:rFonts w:ascii="Calibri" w:hAnsi="Calibri"/>
+                <w:i/>
+                <w:color w:val="3C3C3C"/>
+                <w:sz w:val="20"/>
+              </w:rPr>
+              <w:t>ChromaDB</w:t>
+            </w:r>
+            <w:proofErr w:type="spellEnd"/>
+            <w:r>
+              <w:rPr>
+                <w:rFonts w:ascii="Calibri" w:hAnsi="Calibri"/>
+                <w:i/>
+                <w:color w:val="3C3C3C"/>
+                <w:sz w:val="20"/>
+              </w:rPr>
+              <w:t xml:space="preserve">, </w:t>
+            </w:r>
+            <w:proofErr w:type="spellStart"/>
+            <w:r>
+              <w:rPr>
+                <w:rFonts w:ascii="Calibri" w:hAnsi="Calibri"/>
+                <w:i/>
+                <w:color w:val="3C3C3C"/>
+                <w:sz w:val="20"/>
+              </w:rPr>
+              <w:t>Groq</w:t>
+            </w:r>
+            <w:proofErr w:type="spellEnd"/>
           </w:p>
         </w:tc>
         <w:tc>
@@ -687,8 +992,91 @@
           <w:color w:val="282828"/>
           <w:sz w:val="19"/>
         </w:rPr>
-        <w:t>Architected a full-stack AI talent platform featuring candidate and recruiter portals powered by RAG vector matching, sentence-transformers, and Groq (llama-3.3-70b) for automated ATS resume auditing and match scoring. Built multi-step agentic workflows using LangGraph and deployed backend services with PostgreSQL/Supabase integration.</w:t>
+        <w:t xml:space="preserve">Architected a full-stack AI talent platform featuring candidate and recruiter portals powered by RAG vector matching, sentence-transformers, and </w:t>
       </w:r>
+      <w:proofErr w:type="spellStart"/>
+      <w:r>
+        <w:rPr>
+          <w:rFonts w:ascii="Calibri" w:hAnsi="Calibri"/>
+          <w:color w:val="282828"/>
+          <w:sz w:val="19"/>
+        </w:rPr>
+        <w:t>Groq</w:t>
+      </w:r>
+      <w:proofErr w:type="spellEnd"/>
+      <w:r>
+        <w:rPr>
+          <w:rFonts w:ascii="Calibri" w:hAnsi="Calibri"/>
+          <w:color w:val="282828"/>
+          <w:sz w:val="19"/>
+        </w:rPr>
+        <w:t xml:space="preserve"> (llama-3.3-70b) for automated ATS resume auditing and match scoring. Built multi-step agentic workflows using LangGraph and deployed backend services with PostgreSQL/</w:t>
+      </w:r>
+      <w:proofErr w:type="spellStart"/>
+      <w:r>
+        <w:rPr>
+          <w:rFonts w:ascii="Calibri" w:hAnsi="Calibri"/>
+          <w:color w:val="282828"/>
+          <w:sz w:val="19"/>
+        </w:rPr>
+        <w:t>Supabase</w:t>
+      </w:r>
+      <w:proofErr w:type="spellEnd"/>
+      <w:r>
+        <w:rPr>
+          <w:rFonts w:ascii="Calibri" w:hAnsi="Calibri"/>
+          <w:color w:val="282828"/>
+          <w:sz w:val="19"/>
+        </w:rPr>
+        <w:t xml:space="preserve"> integration.</w:t>
+      </w:r>
+      <w:r>
+        <w:t xml:space="preserve"> </w:t>
+      </w:r>
+      <w:r>
+        <w:rPr>
+          <w:rFonts w:ascii="Calibri" w:hAnsi="Calibri"/>
+          <w:color w:val="282828"/>
+          <w:sz w:val="19"/>
+        </w:rPr>
+        <w:t>Built candidate-facing features including resume scoring, personalized learning roadmaps, interview preparation content, and progress tracking to help candidates improve their job readiness.</w:t>
+      </w:r>
+      <w:r>
+        <w:t xml:space="preserve"> </w:t>
+      </w:r>
+    </w:p>
+    <w:p>
+      <w:pPr>
+        <w:pStyle w:val="ListBullet"/>
+        <w:spacing w:before="20" w:after="40" w:line="269" w:lineRule="auto"/>
+      </w:pPr>
+      <w:r>
+        <w:rPr>
+          <w:rFonts w:ascii="Calibri" w:hAnsi="Calibri"/>
+          <w:color w:val="282828"/>
+          <w:sz w:val="19"/>
+        </w:rPr>
+        <w:t>Implemented JWT-based authentication with Google OAuth2 login and used Redis caching to speed up repeated resume queries. Managed database schema changes using Alembic migrations</w:t>
+      </w:r>
+      <w:r>
+        <w:rPr>
+          <w:rFonts w:ascii="Calibri" w:hAnsi="Calibri"/>
+          <w:color w:val="282828"/>
+          <w:sz w:val="19"/>
+        </w:rPr>
+        <w:t>.</w:t>
+      </w:r>
+    </w:p>
+    <w:p>
+      <w:pPr>
+        <w:pStyle w:val="ListBullet"/>
+        <w:numPr>
+          <w:ilvl w:val="0"/>
+          <w:numId w:val="0"/>
+        </w:numPr>
+        <w:spacing w:before="20" w:after="40" w:line="269" w:lineRule="auto"/>
+        <w:ind w:left="360"/>
+      </w:pPr>
     </w:p>
     <w:tbl>
       <w:tblPr>
@@ -713,6 +1101,7 @@
             <w:pPr>
               <w:spacing w:before="80" w:after="20"/>
             </w:pPr>
+            <w:proofErr w:type="spellStart"/>
             <w:r>
               <w:rPr>
                 <w:rFonts w:ascii="Calibri" w:hAnsi="Calibri"/>
@@ -720,7 +1109,18 @@
                 <w:color w:val="1E1E1E"/>
                 <w:sz w:val="21"/>
               </w:rPr>
-              <w:t>SignBridge AI – Real-Time Sign Language Interpreter</w:t>
+              <w:lastRenderedPageBreak/>
+              <w:t>SignBridge</w:t>
+            </w:r>
+            <w:proofErr w:type="spellEnd"/>
+            <w:r>
+              <w:rPr>
+                <w:rFonts w:ascii="Calibri" w:hAnsi="Calibri"/>
+                <w:b/>
+                <w:color w:val="1E1E1E"/>
+                <w:sz w:val="21"/>
+              </w:rPr>
+              <w:t xml:space="preserve"> AI –Sign Language Interpreter</w:t>
             </w:r>
             <w:r>
               <w:rPr>
@@ -729,8 +1129,39 @@
                 <w:color w:val="3C3C3C"/>
                 <w:sz w:val="20"/>
               </w:rPr>
-              <w:t xml:space="preserve"> – MediaPipe, OpenCV, Bi-GRU, FastAPI</w:t>
+              <w:t xml:space="preserve"> – </w:t>
             </w:r>
+            <w:proofErr w:type="spellStart"/>
+            <w:r>
+              <w:rPr>
+                <w:rFonts w:ascii="Calibri" w:hAnsi="Calibri"/>
+                <w:i/>
+                <w:color w:val="3C3C3C"/>
+                <w:sz w:val="20"/>
+              </w:rPr>
+              <w:t>MediaPipe</w:t>
+            </w:r>
+            <w:proofErr w:type="spellEnd"/>
+            <w:r>
+              <w:rPr>
+                <w:rFonts w:ascii="Calibri" w:hAnsi="Calibri"/>
+                <w:i/>
+                <w:color w:val="3C3C3C"/>
+                <w:sz w:val="20"/>
+              </w:rPr>
+              <w:t xml:space="preserve">, OpenCV, Bi-GRU, </w:t>
+            </w:r>
+            <w:proofErr w:type="spellStart"/>
+            <w:r>
+              <w:rPr>
+                <w:rFonts w:ascii="Calibri" w:hAnsi="Calibri"/>
+                <w:i/>
+                <w:color w:val="3C3C3C"/>
+                <w:sz w:val="20"/>
+              </w:rPr>
+              <w:t>FastAPI</w:t>
+            </w:r>
+            <w:proofErr w:type="spellEnd"/>
           </w:p>
         </w:tc>
         <w:tc>
@@ -766,8 +1197,25 @@
           <w:color w:val="282828"/>
           <w:sz w:val="19"/>
         </w:rPr>
-        <w:lastRenderedPageBreak/>
-        <w:t>Developed a real-time gesture translation engine converting ISL/ASL signs into text and natural speech at 60 FPS with 96.25% accuracy and 94.82% Dice Score using a FastAPI streaming backend. Formulated landmark feature pipelines across 50+ video sequences per gesture using a Bidirectional GRU / LSTM architecture.</w:t>
+        <w:t xml:space="preserve">Developed a real-time gesture translation engine converting ISL/ASL signs into text and natural speech at 60 FPS with 96.25% accuracy and 94.82% Dice Score using a </w:t>
+      </w:r>
+      <w:proofErr w:type="spellStart"/>
+      <w:r>
+        <w:rPr>
+          <w:rFonts w:ascii="Calibri" w:hAnsi="Calibri"/>
+          <w:color w:val="282828"/>
+          <w:sz w:val="19"/>
+        </w:rPr>
+        <w:t>FastAPI</w:t>
+      </w:r>
+      <w:proofErr w:type="spellEnd"/>
+      <w:r>
+        <w:rPr>
+          <w:rFonts w:ascii="Calibri" w:hAnsi="Calibri"/>
+          <w:color w:val="282828"/>
+          <w:sz w:val="19"/>
+        </w:rPr>
+        <w:t xml:space="preserve"> streaming backend. Formulated landmark feature pipelines across 50+ video sequences per gesture using a Bidirectional GRU / LSTM architecture.</w:t>
       </w:r>
     </w:p>
     <w:tbl>
@@ -793,6 +1241,7 @@
             <w:pPr>
               <w:spacing w:before="80" w:after="20"/>
             </w:pPr>
+            <w:proofErr w:type="spellStart"/>
             <w:r>
               <w:rPr>
                 <w:rFonts w:ascii="Calibri" w:hAnsi="Calibri"/>
@@ -800,7 +1249,17 @@
                 <w:color w:val="1E1E1E"/>
                 <w:sz w:val="21"/>
               </w:rPr>
-              <w:t>CropSense – Precision Agriculture Optimization Engine</w:t>
+              <w:t>CropSense</w:t>
+            </w:r>
+            <w:proofErr w:type="spellEnd"/>
+            <w:r>
+              <w:rPr>
+                <w:rFonts w:ascii="Calibri" w:hAnsi="Calibri"/>
+                <w:b/>
+                <w:color w:val="1E1E1E"/>
+                <w:sz w:val="21"/>
+              </w:rPr>
+              <w:t xml:space="preserve"> –Agriculture Optimization Engine</w:t>
             </w:r>
             <w:r>
               <w:rPr>
@@ -809,7 +1268,27 @@
                 <w:color w:val="3C3C3C"/>
                 <w:sz w:val="20"/>
               </w:rPr>
-              <w:t xml:space="preserve"> – Python, FastAPI, GitHub Actions</w:t>
+              <w:t xml:space="preserve"> – Python, </w:t>
+            </w:r>
+            <w:proofErr w:type="spellStart"/>
+            <w:r>
+              <w:rPr>
+                <w:rFonts w:ascii="Calibri" w:hAnsi="Calibri"/>
+                <w:i/>
+                <w:color w:val="3C3C3C"/>
+                <w:sz w:val="20"/>
+              </w:rPr>
+              <w:t>FastAPI</w:t>
+            </w:r>
+            <w:proofErr w:type="spellEnd"/>
+            <w:r>
+              <w:rPr>
+                <w:rFonts w:ascii="Calibri" w:hAnsi="Calibri"/>
+                <w:i/>
+                <w:color w:val="3C3C3C"/>
+                <w:sz w:val="20"/>
+              </w:rPr>
+              <w:t>, GitHub Actions</w:t>
             </w:r>
           </w:p>
         </w:tc>
@@ -896,7 +1375,27 @@
                 <w:color w:val="1E1E1E"/>
                 <w:sz w:val="21"/>
               </w:rPr>
-              <w:t>Vidya Pratishthan's Kamalnayan Bajaj Institute of Engineering &amp; Technology</w:t>
+              <w:t xml:space="preserve">Vidya </w:t>
+            </w:r>
+            <w:proofErr w:type="spellStart"/>
+            <w:r>
+              <w:rPr>
+                <w:rFonts w:ascii="Calibri" w:hAnsi="Calibri"/>
+                <w:b/>
+                <w:color w:val="1E1E1E"/>
+                <w:sz w:val="21"/>
+              </w:rPr>
+              <w:t>Pratishthan's</w:t>
+            </w:r>
+            <w:proofErr w:type="spellEnd"/>
+            <w:r>
+              <w:rPr>
+                <w:rFonts w:ascii="Calibri" w:hAnsi="Calibri"/>
+                <w:b/>
+                <w:color w:val="1E1E1E"/>
+                <w:sz w:val="21"/>
+              </w:rPr>
+              <w:t xml:space="preserve"> Kamalnayan Bajaj Institute of Engineering &amp; Technology</w:t>
             </w:r>
             <w:r>
               <w:rPr>
@@ -940,7 +1439,25 @@
           <w:i/>
           <w:sz w:val="19"/>
         </w:rPr>
-        <w:t>Bachelor of Engineering (B.E.) in Artificial Intelligence &amp; Data Science  |  CGPA: 8.19 / 10.0</w:t>
+        <w:t xml:space="preserve">Bachelor of Engineering (B.E.) in Artificial Intelligence &amp; Data </w:t>
+      </w:r>
+      <w:proofErr w:type="gramStart"/>
+      <w:r>
+        <w:rPr>
+          <w:rFonts w:ascii="Calibri" w:hAnsi="Calibri"/>
+          <w:i/>
+          <w:sz w:val="19"/>
+        </w:rPr>
+        <w:t>Science  |</w:t>
+      </w:r>
+      <w:proofErr w:type="gramEnd"/>
+      <w:r>
+        <w:rPr>
+          <w:rFonts w:ascii="Calibri" w:hAnsi="Calibri"/>
+          <w:i/>
+          <w:sz w:val="19"/>
+        </w:rPr>
+        <w:t xml:space="preserve">  CGPA: 8.19 / 10.0</w:t>
       </w:r>
     </w:p>
     <w:p>
@@ -1003,7 +1520,25 @@
           <w:color w:val="282828"/>
           <w:sz w:val="19"/>
         </w:rPr>
-        <w:t>Empowering Deaf with Indian Sign Language Interpreter using Deep Learning, IEEE MITADTSoCiCon 2024, DOI: 10.1109/MITADTSoCiCon60330.2024.10575064.</w:t>
+        <w:t xml:space="preserve">Empowering Deaf with Indian Sign Language Interpreter using Deep Learning, IEEE </w:t>
+      </w:r>
+      <w:proofErr w:type="spellStart"/>
+      <w:r>
+        <w:rPr>
+          <w:rFonts w:ascii="Calibri" w:hAnsi="Calibri"/>
+          <w:color w:val="282828"/>
+          <w:sz w:val="19"/>
+        </w:rPr>
+        <w:t>MITADTSoCiCon</w:t>
+      </w:r>
+      <w:proofErr w:type="spellEnd"/>
+      <w:r>
+        <w:rPr>
+          <w:rFonts w:ascii="Calibri" w:hAnsi="Calibri"/>
+          <w:color w:val="282828"/>
+          <w:sz w:val="19"/>
+        </w:rPr>
+        <w:t xml:space="preserve"> 2024, DOI: 10.1109/MITADTSoCiCon60330.2024.10575064.</w:t>
       </w:r>
     </w:p>
     <w:sectPr>

</xml_diff>